<commit_message>
docs(bullyproof): guides and package scoped to what Glenn's admins can access; sysadmin guide moves to the clause 6 handover set; reply pins payslip-verified salary maths and dedicated-repo handover
</commit_message>
<xml_diff>
--- a/apps/bullyproof/docs/handover/admin-user-guide.docx
+++ b/apps/bullyproof/docs/handover/admin-user-guide.docx
@@ -1143,7 +1143,7 @@
               <w:rPr>
                 <w:sz w:val="19"/>
               </w:rPr>
-              <w:t>Feature access control and permission templates</w:t>
+              <w:t>Feature access control (day-to-day school activation is on each school's Activation tab)</w:t>
             </w:r>
           </w:p>
         </w:tc>
@@ -3032,7 +3032,12 @@
     </w:p>
     <w:p>
       <w:r>
-        <w:t>Setting dozens of switches per school would be tedious, so the platform has Permission Templates: saved bundles of Access and Visible settings per access level. Find them via the "Permission Templates" card ("One-click unlock or lock permission bundles for schools and platform roles") or at /admin/features/permission-templates.</w:t>
+        <w:t>Setting dozens of switches per school would be tedious, so the platform ships with Permission Templates: pre-built bundles of Access and Visible settings (for example the standard school activation bundle, certification-only, and locked states). Templates are built and maintained at the platform engineering level; as a Bullyproof administrator you select and apply them rather than author them.</w:t>
+      </w:r>
+    </w:p>
+    <w:p>
+      <w:r>
+        <w:t>You work with templates on each school's Activation tab (section 5.6):</w:t>
       </w:r>
     </w:p>
     <w:p>
@@ -3040,7 +3045,7 @@
         <w:pStyle w:val="ListBullet"/>
       </w:pPr>
       <w:r>
-        <w:t>Templates are grouped into two tabs: Schools (templates applied to schools) and Platform Access Levels (templates applied to platform roles).</w:t>
+        <w:t>The tab lists the available templates as cards with name, description and rule count.</w:t>
       </w:r>
     </w:p>
     <w:p>
@@ -3048,7 +3053,7 @@
         <w:pStyle w:val="ListBullet"/>
       </w:pPr>
       <w:r>
-        <w:t>Each template card shows its name, description, and buttons: "Edit matrix", "Unlock" (apply), and "Lock" (revoke).</w:t>
+        <w:t>A green "Template active" badge shows when the school's current permissions already match that template; otherwise the card reads "Not active".</w:t>
       </w:r>
     </w:p>
     <w:p>
@@ -3056,33 +3061,17 @@
         <w:pStyle w:val="ListBullet"/>
       </w:pPr>
       <w:r>
-        <w:t>School templates that are currently in force somewhere show a green badge reading "Active on N schools". Inside the Unlock or Lock dialog, each school that already matches the template shows a green "Active" chip.</w:t>
-      </w:r>
-    </w:p>
-    <w:p>
-      <w:pPr>
-        <w:pStyle w:val="ListBullet"/>
-      </w:pPr>
-      <w:r>
-        <w:t>"Unlock" opens a dialog where you review the template's permission matrix, tick the target schools (or roles), and confirm. "Lock" is the same in reverse: it removes the template's permissions from the selected schools.</w:t>
-      </w:r>
-    </w:p>
-    <w:p>
-      <w:pPr>
-        <w:pStyle w:val="ListBullet"/>
-      </w:pPr>
-      <w:r>
-        <w:t>"Edit matrix" opens the template editor: a grid of features (rows) against access levels (columns), with Access and Visible checkboxes in every cell, plus column controls to tick a whole column at once and an import tool to copy rules from another template.</w:t>
+        <w:t>Click "Apply template" (or "Re-apply template" on an already-active card) and confirm. The card turns green once applied.</w:t>
       </w:r>
     </w:p>
     <w:p>
       <w:r>
-        <w:t>[Screenshot: Permission Templates page with an Active on N schools badge]</w:t>
+        <w:t>[Screenshot: a school's Activation tab with a Template active badge on the applied card]</w:t>
       </w:r>
     </w:p>
     <w:p>
       <w:r>
-        <w:t>The everyday workflow is: onboard the school (section 5.4), then apply the standard school template from the Activation tab or the Unlock dialog. Reserve the per-feature switches for one-off adjustments.</w:t>
+        <w:t>The everyday workflow is: onboard the school (section 5.4), then apply the standard school template from the Activation tab. Reserve the per-feature switches (section 8.2) for one-off adjustments. If a new template or a change to an existing bundle is needed, raise it with the platform team.</w:t>
       </w:r>
     </w:p>
     <w:p>
@@ -3685,7 +3674,7 @@
         <w:pStyle w:val="ListBullet"/>
       </w:pPr>
       <w:r>
-        <w:t>Onboarding: school readiness: accounts and licences, plus (in all-schools scope) the "Active schools with no lessons yet" table listing schools with an active licence but no lessons, with days since licence start, class and teacher counts, and their activation status (Active, Certification, or Locked, based on which permission template is applied).</w:t>
+        <w:t>Onboarding: school readiness: accounts and licences, plus (in all-schools scope) the "Active schools with no lessons yet" table listing schools with an active licence but no lessons, with days since licence start, class and teacher counts, and their activation status (Active, Certification, or Locked, based on the school's activation status).</w:t>
       </w:r>
     </w:p>
     <w:p>

</xml_diff>

<commit_message>
docs(bullyproof): guide covers certificate View button, dashboard card and Profile menu entry
</commit_message>
<xml_diff>
--- a/apps/bullyproof/docs/handover/admin-user-guide.docx
+++ b/apps/bullyproof/docs/handover/admin-user-guide.docx
@@ -3833,12 +3833,12 @@
     </w:p>
     <w:p>
       <w:r>
-        <w:t>When every topic (and quiz) in the course is complete, the certificate appears in place of the current-topic card. It shows the completion date, the teacher's name, the line "Has successfully completed the Amayda Program", and an "AP Certified" badge. The Download button downloads it as a PDF; the certificate is formally issued the first time it is downloaded.</w:t>
+        <w:t>When every topic (and quiz) in the course is complete, the certificate appears in place of the current-topic card. It shows the completion date, the teacher's name, the line "Has successfully completed the Amayda Program", and an "AP Certified" badge. The View button opens the certificate PDF in the browser; the Download button saves it. The certificate is formally issued the first time it is viewed or downloaded. The same certificate card, with the same View and Download buttons, appears on the teacher's dashboard once certification is complete.</w:t>
       </w:r>
     </w:p>
     <w:p>
       <w:r>
-        <w:t>Certificates also appear on the teacher's Profile page under Certificates, each with its completion date and its own Download button, so a teacher can re-download at any time.</w:t>
+        <w:t>Certificates also appear on the teacher's Profile page under Certificates, each with its completion date and its own View and Download buttons, so a teacher can revisit them at any time. The Profile page is reachable from the account menu in the sidebar footer (Profile).</w:t>
       </w:r>
     </w:p>
     <w:p>

</xml_diff>

<commit_message>
feat(bullyproof): high-level badge summary for school Feature Access oversight; admin guide v1.1 clarifies section 8; UAT reply covers tooling boundary
</commit_message>
<xml_diff>
--- a/apps/bullyproof/docs/handover/admin-user-guide.docx
+++ b/apps/bullyproof/docs/handover/admin-user-guide.docx
@@ -80,7 +80,7 @@
           <w:color w:val="6B7280"/>
           <w:sz w:val="21"/>
         </w:rPr>
-        <w:t>Handover documentation for Bullyproof Australia (deliverable D6). This guide covers day-to-day administration of the Bullyproof platform. A companion System Administrator Guide covers hosting, configuration, and technical operations.</w:t>
+        <w:t>Handover documentation for Bullyproof Australia (deliverable D6), version 1.1. This guide covers day-to-day administration of the Bullyproof platform. A companion System Administrator Guide covers hosting, configuration, and technical operations. Version 1.1 clarifies section 8: feature access is presented for oversight, with configuration managed at the platform engineering level.</w:t>
       </w:r>
     </w:p>
     <w:p>
@@ -899,7 +899,7 @@
     </w:p>
     <w:p>
       <w:r>
-        <w:t>On top of access levels, the platform has a fine-grained feature permission system that can switch individual features on or off globally, per access level, per school, or per user. Section 8 explains how to manage it.</w:t>
+        <w:t>On top of access levels, the platform has a fine-grained feature permission system that can switch individual features on or off globally, per access level, per school, or per user. The system is configured at the platform engineering level; section 8 explains how it works, how to view what each school can access, and how to activate schools with permission templates.</w:t>
       </w:r>
     </w:p>
     <w:p>
@@ -1278,7 +1278,7 @@
               <w:rPr>
                 <w:sz w:val="19"/>
               </w:rPr>
-              <w:t>Feature access control (day-to-day school activation is on each school's Activation tab)</w:t>
+              <w:t>Feature access control console (platform engineering level; day-to-day school activation is on each school's Activation tab)</w:t>
             </w:r>
           </w:p>
         </w:tc>
@@ -2291,7 +2291,7 @@
               <w:rPr>
                 <w:sz w:val="19"/>
               </w:rPr>
-              <w:t>Per-school feature permissions (shown only if you can manage features)</w:t>
+              <w:t>Read-only view of the school's feature access (editing is a platform engineering function)</w:t>
             </w:r>
           </w:p>
         </w:tc>
@@ -2882,7 +2882,7 @@
               <w:rPr>
                 <w:sz w:val="19"/>
               </w:rPr>
-              <w:t>Per-user feature permission overrides</w:t>
+              <w:t>Per-user feature permission overrides (platform engineering level)</w:t>
             </w:r>
           </w:p>
         </w:tc>
@@ -3097,7 +3097,7 @@
     </w:p>
     <w:p>
       <w:r>
-        <w:t>Open Admin &gt; Features (/admin/features). This is the platform's access control panel, titled "Feature Access Control".</w:t>
+        <w:t>Feature permissions determine what every user can see and do. As a Bullyproof administrator you work with them in two ways: viewing each school's feature access from the school drawer, and activating schools by applying permission templates. The configuration console itself (Admin &gt; Features, titled "Feature Access Control") sits at the platform engineering level.</w:t>
       </w:r>
     </w:p>
     <w:p>
@@ -3198,49 +3198,12 @@
           <w:color w:val="1F2937"/>
           <w:sz w:val="25"/>
         </w:rPr>
-        <w:t>8.2 Managing permissions</w:t>
+        <w:t>8.2 Viewing feature access</w:t>
       </w:r>
     </w:p>
     <w:p>
       <w:r>
-        <w:t>The Features section is organised into cards by area; open one to see its features and the permission tabs:</w:t>
-      </w:r>
-    </w:p>
-    <w:p>
-      <w:pPr>
-        <w:pStyle w:val="ListBullet"/>
-      </w:pPr>
-      <w:r>
-        <w:t>Global: switch "Global Access" and "Global Visible" per feature.</w:t>
-      </w:r>
-    </w:p>
-    <w:p>
-      <w:pPr>
-        <w:pStyle w:val="ListBullet"/>
-      </w:pPr>
-      <w:r>
-        <w:t>Platform Access Levels: pick a role, then set overrides. "Role settings override Global."</w:t>
-      </w:r>
-    </w:p>
-    <w:p>
-      <w:pPr>
-        <w:pStyle w:val="ListBullet"/>
-      </w:pPr>
-      <w:r>
-        <w:t>Schools: pick a school, then either set school-wide overrides or filter to a single school role.</w:t>
-      </w:r>
-    </w:p>
-    <w:p>
-      <w:pPr>
-        <w:pStyle w:val="ListBullet"/>
-      </w:pPr>
-      <w:r>
-        <w:t>Users: pick a user. "User settings override School, Role, and Global."</w:t>
-      </w:r>
-    </w:p>
-    <w:p>
-      <w:r>
-        <w:t>Each override table shows what is inherited from the level above, so you can see the effective result before you change anything. You can also create new feature entries with the "Create Feature" dialog, though in practice new features are added by the development team.</w:t>
+        <w:t>Each school's drawer has a Feature Access tab (Admin &gt; Schools &gt; open a school &gt; Feature Access). It shows, at a glance, what the school can currently use ("Available to this school") and anything shown to its users but locked ("Visible but locked"). The view is read-only for administrators: changes to feature permissions, the creation of new feature entries, and configuration at the global, access-level or per-user layers are platform engineering functions. If a school's feature access needs to change beyond what a template provides, raise it with the platform team.</w:t>
       </w:r>
     </w:p>
     <w:p>
@@ -3294,7 +3257,7 @@
     </w:p>
     <w:p>
       <w:r>
-        <w:t>The everyday workflow is: onboard the school (section 5.4), then apply the standard school template from the Activation tab. Reserve the per-feature switches (section 8.2) for one-off adjustments. If a new template or a change to an existing bundle is needed, raise it with the platform team.</w:t>
+        <w:t>The everyday workflow is: onboard the school (section 5.4), then apply the standard school template from the Activation tab, and use the Feature Access view (section 8.2) to confirm the result. If a one-off adjustment, a new template or a change to an existing bundle is needed, raise it with the platform team.</w:t>
       </w:r>
     </w:p>
     <w:p>

</xml_diff>